<commit_message>
vault backup: 2026-05-04 23:26:15
</commit_message>
<xml_diff>
--- a/template.docx
+++ b/template.docx
@@ -7738,6 +7738,7 @@
           <w:szCs w:val="20"/>
           <w:lang w:val="hr-HR" w:eastAsia="hr-HR"/>
         </w:rPr>
+        <w:lastRenderedPageBreak/>
         <w:t>minim</w:t>
       </w:r>
       <w:proofErr w:type="spellEnd"/>
@@ -8944,7 +8945,6 @@
           <w:szCs w:val="20"/>
           <w:lang w:val="hr-HR" w:eastAsia="hr-HR"/>
         </w:rPr>
-        <w:lastRenderedPageBreak/>
         <w:t>labore</w:t>
       </w:r>
       <w:proofErr w:type="spellEnd"/>
@@ -13116,10 +13116,10 @@
       </w:pPr>
     </w:lvl>
   </w:abstractNum>
-  <w:num w:numId="1" w16cid:durableId="1891572139">
+  <w:num w:numId="1" w16cid:durableId="691418188">
     <w:abstractNumId w:val="0"/>
   </w:num>
-  <w:num w:numId="2" w16cid:durableId="1574856873">
+  <w:num w:numId="2" w16cid:durableId="1418944996">
     <w:abstractNumId w:val="1"/>
   </w:num>
 </w:numbering>
@@ -13966,6 +13966,15 @@
 </file>
 
 <file path=customXml/item1.xml><?xml version="1.0" encoding="utf-8"?>
+<?mso-contentType ?>
+<FormTemplates xmlns="http://schemas.microsoft.com/sharepoint/v3/contenttype/forms">
+  <Display>DocumentLibraryForm</Display>
+  <Edit>DocumentLibraryForm</Edit>
+  <New>DocumentLibraryForm</New>
+</FormTemplates>
+</file>
+
+<file path=customXml/item2.xml><?xml version="1.0" encoding="utf-8"?>
 <ct:contentTypeSchema xmlns:ct="http://schemas.microsoft.com/office/2006/metadata/contentType" xmlns:ma="http://schemas.microsoft.com/office/2006/metadata/properties/metaAttributes" ct:_="" ma:_="" ma:contentTypeName="Dokument" ma:contentTypeID="0x010100F914739E194A8D438C7D3CB7E4B2080B" ma:contentTypeVersion="11" ma:contentTypeDescription="Stvaranje novog dokumenta." ma:contentTypeScope="" ma:versionID="18230099d796ac920e6d5cd31ce05bdf">
   <xsd:schema xmlns:xsd="http://www.w3.org/2001/XMLSchema" xmlns:xs="http://www.w3.org/2001/XMLSchema" xmlns:p="http://schemas.microsoft.com/office/2006/metadata/properties" xmlns:ns2="0b6f7929-0fc0-44b3-be13-ffccd22fc65b" xmlns:ns3="cac70137-63ca-417b-a3fc-2fe86776ab8a" targetNamespace="http://schemas.microsoft.com/office/2006/metadata/properties" ma:root="true" ma:fieldsID="225835406f4cbb6861716aa536b960b3" ns2:_="" ns3:_="">
     <xsd:import namespace="0b6f7929-0fc0-44b3-be13-ffccd22fc65b"/>
@@ -14160,7 +14169,7 @@
 </ct:contentTypeSchema>
 </file>
 
-<file path=customXml/item2.xml><?xml version="1.0" encoding="utf-8"?>
+<file path=customXml/item3.xml><?xml version="1.0" encoding="utf-8"?>
 <p:properties xmlns:p="http://schemas.microsoft.com/office/2006/metadata/properties" xmlns:xsi="http://www.w3.org/2001/XMLSchema-instance" xmlns:pc="http://schemas.microsoft.com/office/infopath/2007/PartnerControls">
   <documentManagement>
     <TaxCatchAll xmlns="cac70137-63ca-417b-a3fc-2fe86776ab8a" xsi:nil="true"/>
@@ -14171,16 +14180,15 @@
 </p:properties>
 </file>
 
-<file path=customXml/item3.xml><?xml version="1.0" encoding="utf-8"?>
-<?mso-contentType ?>
-<FormTemplates xmlns="http://schemas.microsoft.com/sharepoint/v3/contenttype/forms">
-  <Display>DocumentLibraryForm</Display>
-  <Edit>DocumentLibraryForm</Edit>
-  <New>DocumentLibraryForm</New>
-</FormTemplates>
+<file path=customXml/itemProps1.xml><?xml version="1.0" encoding="utf-8"?>
+<ds:datastoreItem xmlns:ds="http://schemas.openxmlformats.org/officeDocument/2006/customXml" ds:itemID="{447AAB7D-A5BB-4697-973E-4CEF3E3E1A1A}">
+  <ds:schemaRefs>
+    <ds:schemaRef ds:uri="http://schemas.microsoft.com/sharepoint/v3/contenttype/forms"/>
+  </ds:schemaRefs>
+</ds:datastoreItem>
 </file>
 
-<file path=customXml/itemProps1.xml><?xml version="1.0" encoding="utf-8"?>
+<file path=customXml/itemProps2.xml><?xml version="1.0" encoding="utf-8"?>
 <ds:datastoreItem xmlns:ds="http://schemas.openxmlformats.org/officeDocument/2006/customXml" ds:itemID="{44809754-6C04-4922-9FF2-FF99339548FD}">
   <ds:schemaRefs>
     <ds:schemaRef ds:uri="http://schemas.microsoft.com/office/2006/metadata/contentType"/>
@@ -14199,7 +14207,7 @@
 </ds:datastoreItem>
 </file>
 
-<file path=customXml/itemProps2.xml><?xml version="1.0" encoding="utf-8"?>
+<file path=customXml/itemProps3.xml><?xml version="1.0" encoding="utf-8"?>
 <ds:datastoreItem xmlns:ds="http://schemas.openxmlformats.org/officeDocument/2006/customXml" ds:itemID="{70163771-6AE7-4545-8CC3-F4F032ACBE34}">
   <ds:schemaRefs>
     <ds:schemaRef ds:uri="http://schemas.microsoft.com/office/2006/metadata/properties"/>
@@ -14208,12 +14216,4 @@
     <ds:schemaRef ds:uri="0b6f7929-0fc0-44b3-be13-ffccd22fc65b"/>
   </ds:schemaRefs>
 </ds:datastoreItem>
-</file>
-
-<file path=customXml/itemProps3.xml><?xml version="1.0" encoding="utf-8"?>
-<ds:datastoreItem xmlns:ds="http://schemas.openxmlformats.org/officeDocument/2006/customXml" ds:itemID="{447AAB7D-A5BB-4697-973E-4CEF3E3E1A1A}">
-  <ds:schemaRefs>
-    <ds:schemaRef ds:uri="http://schemas.microsoft.com/sharepoint/v3/contenttype/forms"/>
-  </ds:schemaRefs>
-</ds:datastoreItem>
 </file>
</xml_diff>